<commit_message>
feat: expose audited Designer protocol document export API with selective output and eTMF archival integration (#706)
Expose authenticated GET /api/v1/studies/{study_id}/export endpoint in Designer supporting format (pdf/docx) and output section (narrative/synopsis/soa/combined) parameter selection. Return 422 for invalid parameters and 404 for absent studies. Record Part 11 compliant audit events, and support configurable (strict or best-effort) archival forwarding to eTMF. Integrate unit and integration tests.

Co-authored-by: google-labs-jules[bot] <161369871+google-labs-jules[bot]@users.noreply.github.com>
</commit_message>
<xml_diff>
--- a/apps/designer/templates/protocol_template.docx
+++ b/apps/designer/templates/protocol_template.docx
@@ -49,6 +49,11 @@
     <w:p>
       <w:r>
         <w:br w:type="page"/>
+      </w:r>
+    </w:p>
+    <w:p>
+      <w:r>
+        <w:t>{% if output == 'combined' or output == 'synopsis' %}</w:t>
       </w:r>
     </w:p>
     <w:p>
@@ -147,7 +152,17 @@
     </w:p>
     <w:p>
       <w:r>
+        <w:t>{% endif %}</w:t>
+      </w:r>
+    </w:p>
+    <w:p>
+      <w:r>
         <w:br w:type="page"/>
+      </w:r>
+    </w:p>
+    <w:p>
+      <w:r>
+        <w:t>{% if output == 'combined' or output == 'narrative' %}</w:t>
       </w:r>
     </w:p>
     <w:p>
@@ -259,7 +274,17 @@
     </w:p>
     <w:p>
       <w:r>
+        <w:t>{% endif %}</w:t>
+      </w:r>
+    </w:p>
+    <w:p>
+      <w:r>
         <w:br w:type="page"/>
+      </w:r>
+    </w:p>
+    <w:p>
+      <w:r>
+        <w:t>{% if output == 'combined' or output == 'soa' %}</w:t>
       </w:r>
     </w:p>
     <w:p>
@@ -273,6 +298,11 @@
     <w:p>
       <w:r>
         <w:t>{{ soa_subdoc }}</w:t>
+      </w:r>
+    </w:p>
+    <w:p>
+      <w:r>
+        <w:t>{% endif %}</w:t>
       </w:r>
     </w:p>
     <w:sectPr>

</xml_diff>